<commit_message>
Update Job seeker's playbook.docx
</commit_message>
<xml_diff>
--- a/Job seeker's playbook.docx
+++ b/Job seeker's playbook.docx
@@ -439,47 +439,23 @@
         <w:pStyle w:val="NoSpacing"/>
       </w:pPr>
       <w:r>
-        <w:t xml:space="preserve">**“From Zero to Offer – Integrity-First, Zero-Fabrication </w:t>
-      </w:r>
-      <w:proofErr w:type="gramStart"/>
-      <w:r>
-        <w:t>System”*</w:t>
-      </w:r>
-      <w:proofErr w:type="gramEnd"/>
-      <w:r>
-        <w:t xml:space="preserve">*  </w:t>
-      </w:r>
-    </w:p>
-    <w:p>
-      <w:pPr>
-        <w:pStyle w:val="NoSpacing"/>
-      </w:pPr>
-      <w:r>
-        <w:t>**</w:t>
-      </w:r>
-      <w:proofErr w:type="gramStart"/>
-      <w:r>
-        <w:t>Version:*</w:t>
-      </w:r>
-      <w:proofErr w:type="gramEnd"/>
-      <w:r>
-        <w:t xml:space="preserve">* 1.0 (Draft – March 2026)  </w:t>
-      </w:r>
-    </w:p>
-    <w:p>
-      <w:pPr>
-        <w:pStyle w:val="NoSpacing"/>
-      </w:pPr>
-      <w:r>
-        <w:t xml:space="preserve">**Linked </w:t>
-      </w:r>
-      <w:proofErr w:type="gramStart"/>
-      <w:r>
-        <w:t>Repo:*</w:t>
-      </w:r>
-      <w:proofErr w:type="gramEnd"/>
-      <w:r>
-        <w:t xml:space="preserve">* https://github.com/scottmalin68-commits/Job-Search-Career-Prompts  </w:t>
+        <w:t xml:space="preserve">**“From Zero to Offer – Integrity-First, Zero-Fabrication System”**  </w:t>
+      </w:r>
+    </w:p>
+    <w:p>
+      <w:pPr>
+        <w:pStyle w:val="NoSpacing"/>
+      </w:pPr>
+      <w:r>
+        <w:t xml:space="preserve">**Version:** 1.0 (Draft – March 2026)  </w:t>
+      </w:r>
+    </w:p>
+    <w:p>
+      <w:pPr>
+        <w:pStyle w:val="NoSpacing"/>
+      </w:pPr>
+      <w:r>
+        <w:t xml:space="preserve">**Linked Repo:** https://github.com/scottmalin68-commits/Job-Search-Career-Prompts  </w:t>
       </w:r>
     </w:p>
     <w:p>
@@ -698,36 +674,20 @@
         <w:pStyle w:val="NoSpacing"/>
       </w:pPr>
       <w:r>
-        <w:t xml:space="preserve">**Why it </w:t>
-      </w:r>
-      <w:proofErr w:type="gramStart"/>
-      <w:r>
-        <w:t>matters:*</w:t>
-      </w:r>
-      <w:proofErr w:type="gramEnd"/>
-      <w:r>
-        <w:t>* Every later tool (resume, interview answers, LinkedIn, negotiation) pulls from this governed document. This is your “single source of truth.”</w:t>
-      </w:r>
-    </w:p>
-    <w:p>
-      <w:pPr>
-        <w:pStyle w:val="NoSpacing"/>
-      </w:pPr>
-    </w:p>
-    <w:p>
-      <w:pPr>
-        <w:pStyle w:val="NoSpacing"/>
-      </w:pPr>
-      <w:r>
-        <w:t>**</w:t>
-      </w:r>
-      <w:proofErr w:type="gramStart"/>
-      <w:r>
-        <w:t>Action:*</w:t>
-      </w:r>
-      <w:proofErr w:type="gramEnd"/>
-      <w:r>
-        <w:t>* Run these three prompts in order before you do anything else. Save the output as **Master-Career-Profile.md** — this is your living skills/experience document.</w:t>
+        <w:t>**Why it matters:** Every later tool (resume, interview answers, LinkedIn, negotiation) pulls from this governed document. This is your “single source of truth.”</w:t>
+      </w:r>
+    </w:p>
+    <w:p>
+      <w:pPr>
+        <w:pStyle w:val="NoSpacing"/>
+      </w:pPr>
+    </w:p>
+    <w:p>
+      <w:pPr>
+        <w:pStyle w:val="NoSpacing"/>
+      </w:pPr>
+      <w:r>
+        <w:t>**Action:** Run these three prompts in order before you do anything else. Save the output as **Master-Career-Profile.md** — this is your living skills/experience document.</w:t>
       </w:r>
     </w:p>
     <w:p>
@@ -763,15 +723,7 @@
         <w:pStyle w:val="NoSpacing"/>
       </w:pPr>
       <w:r>
-        <w:t>**</w:t>
-      </w:r>
-      <w:proofErr w:type="gramStart"/>
-      <w:r>
-        <w:t>Goal:*</w:t>
-      </w:r>
-      <w:proofErr w:type="gramEnd"/>
-      <w:r>
-        <w:t>* Walk into the job market with clean assets, automated scanners, and a strong network foundation — so you never scramble later.</w:t>
+        <w:t>**Goal:** Walk into the job market with clean assets, automated scanners, and a strong network foundation — so you never scramble later.</w:t>
       </w:r>
     </w:p>
     <w:p>
@@ -784,15 +736,7 @@
         <w:pStyle w:val="Heading2"/>
       </w:pPr>
       <w:r>
-        <w:t xml:space="preserve">**Step-by-step checklist (follow in this </w:t>
-      </w:r>
-      <w:proofErr w:type="gramStart"/>
-      <w:r>
-        <w:t>order)*</w:t>
-      </w:r>
-      <w:proofErr w:type="gramEnd"/>
-      <w:r>
-        <w:t>*</w:t>
+        <w:t>**Step-by-step checklist (follow in this order)**</w:t>
       </w:r>
     </w:p>
     <w:p>
@@ -1197,15 +1141,7 @@
               <w:pStyle w:val="NoSpacing"/>
             </w:pPr>
             <w:r>
-              <w:t xml:space="preserve"> [</w:t>
-            </w:r>
-            <w:proofErr w:type="gramStart"/>
-            <w:r>
-              <w:t xml:space="preserve">Link]   </w:t>
-            </w:r>
-            <w:proofErr w:type="gramEnd"/>
-            <w:r>
-              <w:t xml:space="preserve">                  </w:t>
+              <w:t xml:space="preserve"> [Link]                     </w:t>
             </w:r>
           </w:p>
         </w:tc>
@@ -1272,15 +1208,7 @@
               <w:pStyle w:val="NoSpacing"/>
             </w:pPr>
             <w:r>
-              <w:t xml:space="preserve"> [</w:t>
-            </w:r>
-            <w:proofErr w:type="gramStart"/>
-            <w:r>
-              <w:t xml:space="preserve">Link]   </w:t>
-            </w:r>
-            <w:proofErr w:type="gramEnd"/>
-            <w:r>
-              <w:t xml:space="preserve">                  </w:t>
+              <w:t xml:space="preserve"> [Link]                     </w:t>
             </w:r>
           </w:p>
         </w:tc>
@@ -1347,15 +1275,7 @@
               <w:pStyle w:val="NoSpacing"/>
             </w:pPr>
             <w:r>
-              <w:t xml:space="preserve"> [</w:t>
-            </w:r>
-            <w:proofErr w:type="gramStart"/>
-            <w:r>
-              <w:t xml:space="preserve">Link]   </w:t>
-            </w:r>
-            <w:proofErr w:type="gramEnd"/>
-            <w:r>
-              <w:t xml:space="preserve">                  </w:t>
+              <w:t xml:space="preserve"> [Link]                     </w:t>
             </w:r>
           </w:p>
         </w:tc>
@@ -1422,15 +1342,7 @@
               <w:pStyle w:val="NoSpacing"/>
             </w:pPr>
             <w:r>
-              <w:t xml:space="preserve"> [</w:t>
-            </w:r>
-            <w:proofErr w:type="gramStart"/>
-            <w:r>
-              <w:t xml:space="preserve">Link]   </w:t>
-            </w:r>
-            <w:proofErr w:type="gramEnd"/>
-            <w:r>
-              <w:t xml:space="preserve">                  </w:t>
+              <w:t xml:space="preserve"> [Link]                     </w:t>
             </w:r>
           </w:p>
         </w:tc>
@@ -1497,15 +1409,7 @@
               <w:pStyle w:val="NoSpacing"/>
             </w:pPr>
             <w:r>
-              <w:t xml:space="preserve"> [</w:t>
-            </w:r>
-            <w:proofErr w:type="gramStart"/>
-            <w:r>
-              <w:t xml:space="preserve">Link]   </w:t>
-            </w:r>
-            <w:proofErr w:type="gramEnd"/>
-            <w:r>
-              <w:t xml:space="preserve">                  </w:t>
+              <w:t xml:space="preserve"> [Link]                     </w:t>
             </w:r>
           </w:p>
         </w:tc>
@@ -1572,15 +1476,7 @@
               <w:pStyle w:val="NoSpacing"/>
             </w:pPr>
             <w:r>
-              <w:t xml:space="preserve"> [</w:t>
-            </w:r>
-            <w:proofErr w:type="gramStart"/>
-            <w:r>
-              <w:t xml:space="preserve">Link]   </w:t>
-            </w:r>
-            <w:proofErr w:type="gramEnd"/>
-            <w:r>
-              <w:t xml:space="preserve">                  </w:t>
+              <w:t xml:space="preserve"> [Link]                     </w:t>
             </w:r>
           </w:p>
         </w:tc>
@@ -1616,15 +1512,7 @@
               <w:pStyle w:val="NoSpacing"/>
             </w:pPr>
             <w:r>
-              <w:t xml:space="preserve"> Before clicking “</w:t>
-            </w:r>
-            <w:proofErr w:type="gramStart"/>
-            <w:r>
-              <w:t xml:space="preserve">Apply”   </w:t>
-            </w:r>
-            <w:proofErr w:type="gramEnd"/>
-            <w:r>
-              <w:t xml:space="preserve">   </w:t>
+              <w:t xml:space="preserve"> Before clicking “Apply”      </w:t>
             </w:r>
           </w:p>
         </w:tc>
@@ -1663,15 +1551,7 @@
               <w:pStyle w:val="NoSpacing"/>
             </w:pPr>
             <w:r>
-              <w:t xml:space="preserve"> [</w:t>
-            </w:r>
-            <w:proofErr w:type="gramStart"/>
-            <w:r>
-              <w:t xml:space="preserve">Link]   </w:t>
-            </w:r>
-            <w:proofErr w:type="gramEnd"/>
-            <w:r>
-              <w:t xml:space="preserve">                  </w:t>
+              <w:t xml:space="preserve"> [Link]                     </w:t>
             </w:r>
           </w:p>
         </w:tc>
@@ -1746,15 +1626,7 @@
               <w:pStyle w:val="NoSpacing"/>
             </w:pPr>
             <w:r>
-              <w:t xml:space="preserve"> [</w:t>
-            </w:r>
-            <w:proofErr w:type="gramStart"/>
-            <w:r>
-              <w:t xml:space="preserve">Link]   </w:t>
-            </w:r>
-            <w:proofErr w:type="gramEnd"/>
-            <w:r>
-              <w:t xml:space="preserve">                  </w:t>
+              <w:t xml:space="preserve"> [Link]                     </w:t>
             </w:r>
           </w:p>
         </w:tc>
@@ -1771,15 +1643,7 @@
       </w:pPr>
       <w:r>
         <w:lastRenderedPageBreak/>
-        <w:t xml:space="preserve">**Lessons Learned Sidebar (add these as callout boxes in </w:t>
-      </w:r>
-      <w:proofErr w:type="gramStart"/>
-      <w:r>
-        <w:t>Word)*</w:t>
-      </w:r>
-      <w:proofErr w:type="gramEnd"/>
-      <w:r>
-        <w:t>*</w:t>
+        <w:t>**Lessons Learned Sidebar (add these as callout boxes in Word)**</w:t>
       </w:r>
     </w:p>
     <w:p>
@@ -1855,15 +1719,7 @@
         <w:pStyle w:val="NoSpacing"/>
       </w:pPr>
       <w:r>
-        <w:t>**What do you want to do next (small bite today</w:t>
-      </w:r>
-      <w:proofErr w:type="gramStart"/>
-      <w:r>
-        <w:t>)?*</w:t>
-      </w:r>
-      <w:proofErr w:type="gramEnd"/>
-      <w:r>
-        <w:t xml:space="preserve">*  </w:t>
+        <w:t xml:space="preserve">**What do you want to do next (small bite today)?**  </w:t>
       </w:r>
     </w:p>
     <w:p>
@@ -1884,15 +1740,7 @@
         <w:pStyle w:val="NoSpacing"/>
       </w:pPr>
       <w:r>
-        <w:t xml:space="preserve">1. “Give me During Part 1 – Application &amp; </w:t>
-      </w:r>
-      <w:proofErr w:type="gramStart"/>
-      <w:r>
-        <w:t>Job Hunting</w:t>
-      </w:r>
-      <w:proofErr w:type="gramEnd"/>
-      <w:r>
-        <w:t xml:space="preserve"> phase”  </w:t>
+        <w:t xml:space="preserve">1. “Give me During Part 1 – Application &amp; Job Hunting phase”  </w:t>
       </w:r>
     </w:p>
     <w:p>
@@ -2009,36 +1857,20 @@
         <w:pStyle w:val="NoSpacing"/>
       </w:pPr>
       <w:r>
-        <w:t>**</w:t>
-      </w:r>
-      <w:proofErr w:type="gramStart"/>
-      <w:r>
-        <w:t>Goal:*</w:t>
-      </w:r>
-      <w:proofErr w:type="gramEnd"/>
-      <w:r>
-        <w:t>* Turn your prepared foundation into targeted, high-quality applications — while minimizing wasted effort and avoiding bad-fit roles.</w:t>
-      </w:r>
-    </w:p>
-    <w:p>
-      <w:pPr>
-        <w:pStyle w:val="NoSpacing"/>
-      </w:pPr>
-    </w:p>
-    <w:p>
-      <w:pPr>
-        <w:pStyle w:val="NoSpacing"/>
-      </w:pPr>
-      <w:r>
-        <w:t xml:space="preserve">**Step-by-step checklist (follow in this order for each job you seriously </w:t>
-      </w:r>
-      <w:proofErr w:type="gramStart"/>
-      <w:r>
-        <w:t>consider)*</w:t>
-      </w:r>
-      <w:proofErr w:type="gramEnd"/>
-      <w:r>
-        <w:t>*</w:t>
+        <w:t>**Goal:** Turn your prepared foundation into targeted, high-quality applications — while minimizing wasted effort and avoiding bad-fit roles.</w:t>
+      </w:r>
+    </w:p>
+    <w:p>
+      <w:pPr>
+        <w:pStyle w:val="NoSpacing"/>
+      </w:pPr>
+    </w:p>
+    <w:p>
+      <w:pPr>
+        <w:pStyle w:val="NoSpacing"/>
+      </w:pPr>
+      <w:r>
+        <w:t>**Step-by-step checklist (follow in this order for each job you seriously consider)**</w:t>
       </w:r>
     </w:p>
     <w:p>
@@ -2067,15 +1899,7 @@
         <w:pStyle w:val="NoSpacing"/>
       </w:pPr>
       <w:r>
-        <w:t xml:space="preserve">   - Supplement with manual searches on LinkedIn, company career pages, </w:t>
-      </w:r>
-      <w:proofErr w:type="gramStart"/>
-      <w:r>
-        <w:t>Indeed</w:t>
-      </w:r>
-      <w:proofErr w:type="gramEnd"/>
-      <w:r>
-        <w:t xml:space="preserve">, etc.  </w:t>
+        <w:t xml:space="preserve">   - Supplement with manual searches on LinkedIn, company career pages, Indeed, etc.  </w:t>
       </w:r>
     </w:p>
     <w:p>
@@ -2471,15 +2295,7 @@
               <w:pStyle w:val="NoSpacing"/>
             </w:pPr>
             <w:r>
-              <w:t xml:space="preserve"> Ongoing (set &amp; </w:t>
-            </w:r>
-            <w:proofErr w:type="gramStart"/>
-            <w:r>
-              <w:t xml:space="preserve">forget)   </w:t>
-            </w:r>
-            <w:proofErr w:type="gramEnd"/>
-            <w:r>
-              <w:t xml:space="preserve">            </w:t>
+              <w:t xml:space="preserve"> Ongoing (set &amp; forget)               </w:t>
             </w:r>
           </w:p>
         </w:tc>
@@ -2518,15 +2334,7 @@
               <w:pStyle w:val="NoSpacing"/>
             </w:pPr>
             <w:r>
-              <w:t xml:space="preserve"> [</w:t>
-            </w:r>
-            <w:proofErr w:type="gramStart"/>
-            <w:r>
-              <w:t xml:space="preserve">Link]   </w:t>
-            </w:r>
-            <w:proofErr w:type="gramEnd"/>
-            <w:r>
-              <w:t xml:space="preserve"> </w:t>
+              <w:t xml:space="preserve"> [Link]    </w:t>
             </w:r>
           </w:p>
         </w:tc>
@@ -2593,15 +2401,7 @@
               <w:pStyle w:val="NoSpacing"/>
             </w:pPr>
             <w:r>
-              <w:t xml:space="preserve"> [</w:t>
-            </w:r>
-            <w:proofErr w:type="gramStart"/>
-            <w:r>
-              <w:t xml:space="preserve">Link]   </w:t>
-            </w:r>
-            <w:proofErr w:type="gramEnd"/>
-            <w:r>
-              <w:t xml:space="preserve"> </w:t>
+              <w:t xml:space="preserve"> [Link]    </w:t>
             </w:r>
           </w:p>
         </w:tc>
@@ -2668,15 +2468,7 @@
               <w:pStyle w:val="NoSpacing"/>
             </w:pPr>
             <w:r>
-              <w:t xml:space="preserve"> [</w:t>
-            </w:r>
-            <w:proofErr w:type="gramStart"/>
-            <w:r>
-              <w:t xml:space="preserve">Link]   </w:t>
-            </w:r>
-            <w:proofErr w:type="gramEnd"/>
-            <w:r>
-              <w:t xml:space="preserve"> </w:t>
+              <w:t xml:space="preserve"> [Link]    </w:t>
             </w:r>
           </w:p>
         </w:tc>
@@ -2743,15 +2535,7 @@
               <w:pStyle w:val="NoSpacing"/>
             </w:pPr>
             <w:r>
-              <w:t xml:space="preserve"> [</w:t>
-            </w:r>
-            <w:proofErr w:type="gramStart"/>
-            <w:r>
-              <w:t xml:space="preserve">Link]   </w:t>
-            </w:r>
-            <w:proofErr w:type="gramEnd"/>
-            <w:r>
-              <w:t xml:space="preserve"> </w:t>
+              <w:t xml:space="preserve"> [Link]    </w:t>
             </w:r>
           </w:p>
         </w:tc>
@@ -2826,15 +2610,7 @@
               <w:pStyle w:val="NoSpacing"/>
             </w:pPr>
             <w:r>
-              <w:t xml:space="preserve"> [</w:t>
-            </w:r>
-            <w:proofErr w:type="gramStart"/>
-            <w:r>
-              <w:t xml:space="preserve">Link]   </w:t>
-            </w:r>
-            <w:proofErr w:type="gramEnd"/>
-            <w:r>
-              <w:t xml:space="preserve"> </w:t>
+              <w:t xml:space="preserve"> [Link]    </w:t>
             </w:r>
           </w:p>
         </w:tc>
@@ -2902,15 +2678,7 @@
               <w:pStyle w:val="NoSpacing"/>
             </w:pPr>
             <w:r>
-              <w:t xml:space="preserve"> [</w:t>
-            </w:r>
-            <w:proofErr w:type="gramStart"/>
-            <w:r>
-              <w:t xml:space="preserve">Link]   </w:t>
-            </w:r>
-            <w:proofErr w:type="gramEnd"/>
-            <w:r>
-              <w:t xml:space="preserve"> </w:t>
+              <w:t xml:space="preserve"> [Link]    </w:t>
             </w:r>
           </w:p>
         </w:tc>
@@ -2977,15 +2745,7 @@
               <w:pStyle w:val="NoSpacing"/>
             </w:pPr>
             <w:r>
-              <w:t xml:space="preserve"> [</w:t>
-            </w:r>
-            <w:proofErr w:type="gramStart"/>
-            <w:r>
-              <w:t xml:space="preserve">Link]   </w:t>
-            </w:r>
-            <w:proofErr w:type="gramEnd"/>
-            <w:r>
-              <w:t xml:space="preserve"> </w:t>
+              <w:t xml:space="preserve"> [Link]    </w:t>
             </w:r>
           </w:p>
         </w:tc>
@@ -3060,15 +2820,7 @@
               <w:pStyle w:val="NoSpacing"/>
             </w:pPr>
             <w:r>
-              <w:t xml:space="preserve"> [</w:t>
-            </w:r>
-            <w:proofErr w:type="gramStart"/>
-            <w:r>
-              <w:t xml:space="preserve">Link]   </w:t>
-            </w:r>
-            <w:proofErr w:type="gramEnd"/>
-            <w:r>
-              <w:t xml:space="preserve"> </w:t>
+              <w:t xml:space="preserve"> [Link]    </w:t>
             </w:r>
           </w:p>
         </w:tc>
@@ -3147,36 +2899,20 @@
         <w:pStyle w:val="NoSpacing"/>
       </w:pPr>
       <w:r>
-        <w:t>**</w:t>
-      </w:r>
-      <w:proofErr w:type="gramStart"/>
-      <w:r>
-        <w:t>Goal:*</w:t>
-      </w:r>
-      <w:proofErr w:type="gramEnd"/>
-      <w:r>
-        <w:t>* Enter every interview calm, prepared, authentic, and resilient — ready to handle pressure, showcase fit, and leave a strong positive impression.</w:t>
-      </w:r>
-    </w:p>
-    <w:p>
-      <w:pPr>
-        <w:pStyle w:val="NoSpacing"/>
-      </w:pPr>
-    </w:p>
-    <w:p>
-      <w:pPr>
-        <w:pStyle w:val="NoSpacing"/>
-      </w:pPr>
-      <w:r>
-        <w:t xml:space="preserve">**Step-by-step checklist (run this sequence before/during/after each interview </w:t>
-      </w:r>
-      <w:proofErr w:type="gramStart"/>
-      <w:r>
-        <w:t>round)*</w:t>
-      </w:r>
-      <w:proofErr w:type="gramEnd"/>
-      <w:r>
-        <w:t>*</w:t>
+        <w:t>**Goal:** Enter every interview calm, prepared, authentic, and resilient — ready to handle pressure, showcase fit, and leave a strong positive impression.</w:t>
+      </w:r>
+    </w:p>
+    <w:p>
+      <w:pPr>
+        <w:pStyle w:val="NoSpacing"/>
+      </w:pPr>
+    </w:p>
+    <w:p>
+      <w:pPr>
+        <w:pStyle w:val="NoSpacing"/>
+      </w:pPr>
+      <w:r>
+        <w:t>**Step-by-step checklist (run this sequence before/during/after each interview round)**</w:t>
       </w:r>
     </w:p>
     <w:p>
@@ -3571,15 +3307,7 @@
               <w:pStyle w:val="NoSpacing"/>
             </w:pPr>
             <w:r>
-              <w:t xml:space="preserve"> [</w:t>
-            </w:r>
-            <w:proofErr w:type="gramStart"/>
-            <w:r>
-              <w:t xml:space="preserve">Link]   </w:t>
-            </w:r>
-            <w:proofErr w:type="gramEnd"/>
-            <w:r>
-              <w:t xml:space="preserve"> </w:t>
+              <w:t xml:space="preserve"> [Link]    </w:t>
             </w:r>
           </w:p>
         </w:tc>
@@ -3646,15 +3374,7 @@
               <w:pStyle w:val="NoSpacing"/>
             </w:pPr>
             <w:r>
-              <w:t xml:space="preserve"> [</w:t>
-            </w:r>
-            <w:proofErr w:type="gramStart"/>
-            <w:r>
-              <w:t xml:space="preserve">Link]   </w:t>
-            </w:r>
-            <w:proofErr w:type="gramEnd"/>
-            <w:r>
-              <w:t xml:space="preserve"> </w:t>
+              <w:t xml:space="preserve"> [Link]    </w:t>
             </w:r>
           </w:p>
         </w:tc>
@@ -3721,15 +3441,7 @@
               <w:pStyle w:val="NoSpacing"/>
             </w:pPr>
             <w:r>
-              <w:t xml:space="preserve"> [</w:t>
-            </w:r>
-            <w:proofErr w:type="gramStart"/>
-            <w:r>
-              <w:t xml:space="preserve">Link]   </w:t>
-            </w:r>
-            <w:proofErr w:type="gramEnd"/>
-            <w:r>
-              <w:t xml:space="preserve"> </w:t>
+              <w:t xml:space="preserve"> [Link]    </w:t>
             </w:r>
           </w:p>
         </w:tc>
@@ -3796,15 +3508,7 @@
               <w:pStyle w:val="NoSpacing"/>
             </w:pPr>
             <w:r>
-              <w:t xml:space="preserve"> [</w:t>
-            </w:r>
-            <w:proofErr w:type="gramStart"/>
-            <w:r>
-              <w:t xml:space="preserve">Link]   </w:t>
-            </w:r>
-            <w:proofErr w:type="gramEnd"/>
-            <w:r>
-              <w:t xml:space="preserve"> </w:t>
+              <w:t xml:space="preserve"> [Link]    </w:t>
             </w:r>
           </w:p>
         </w:tc>
@@ -3819,15 +3523,7 @@
               <w:pStyle w:val="NoSpacing"/>
             </w:pPr>
             <w:r>
-              <w:t xml:space="preserve"> AI Voice Interview Suite (Grok/Gemini/</w:t>
-            </w:r>
-            <w:proofErr w:type="gramStart"/>
-            <w:r>
-              <w:t xml:space="preserve">ChatGPT)   </w:t>
-            </w:r>
-            <w:proofErr w:type="gramEnd"/>
-            <w:r>
-              <w:t xml:space="preserve">  </w:t>
+              <w:t xml:space="preserve"> AI Voice Interview Suite (Grok/Gemini/ChatGPT)     </w:t>
             </w:r>
           </w:p>
         </w:tc>
@@ -3879,15 +3575,7 @@
               <w:pStyle w:val="NoSpacing"/>
             </w:pPr>
             <w:r>
-              <w:t xml:space="preserve"> [</w:t>
-            </w:r>
-            <w:proofErr w:type="gramStart"/>
-            <w:r>
-              <w:t xml:space="preserve">Link]   </w:t>
-            </w:r>
-            <w:proofErr w:type="gramEnd"/>
-            <w:r>
-              <w:t xml:space="preserve"> </w:t>
+              <w:t xml:space="preserve"> [Link]    </w:t>
             </w:r>
           </w:p>
         </w:tc>
@@ -3954,15 +3642,7 @@
               <w:pStyle w:val="NoSpacing"/>
             </w:pPr>
             <w:r>
-              <w:t xml:space="preserve"> [</w:t>
-            </w:r>
-            <w:proofErr w:type="gramStart"/>
-            <w:r>
-              <w:t xml:space="preserve">Link]   </w:t>
-            </w:r>
-            <w:proofErr w:type="gramEnd"/>
-            <w:r>
-              <w:t xml:space="preserve"> </w:t>
+              <w:t xml:space="preserve"> [Link]    </w:t>
             </w:r>
           </w:p>
         </w:tc>
@@ -4029,15 +3709,7 @@
               <w:pStyle w:val="NoSpacing"/>
             </w:pPr>
             <w:r>
-              <w:t xml:space="preserve"> [</w:t>
-            </w:r>
-            <w:proofErr w:type="gramStart"/>
-            <w:r>
-              <w:t xml:space="preserve">Link]   </w:t>
-            </w:r>
-            <w:proofErr w:type="gramEnd"/>
-            <w:r>
-              <w:t xml:space="preserve"> </w:t>
+              <w:t xml:space="preserve"> [Link]    </w:t>
             </w:r>
           </w:p>
         </w:tc>
@@ -4104,15 +3776,7 @@
               <w:pStyle w:val="NoSpacing"/>
             </w:pPr>
             <w:r>
-              <w:t xml:space="preserve"> [</w:t>
-            </w:r>
-            <w:proofErr w:type="gramStart"/>
-            <w:r>
-              <w:t xml:space="preserve">Link]   </w:t>
-            </w:r>
-            <w:proofErr w:type="gramEnd"/>
-            <w:r>
-              <w:t xml:space="preserve"> </w:t>
+              <w:t xml:space="preserve"> [Link]    </w:t>
             </w:r>
           </w:p>
         </w:tc>
@@ -4179,15 +3843,7 @@
               <w:pStyle w:val="NoSpacing"/>
             </w:pPr>
             <w:r>
-              <w:t xml:space="preserve"> [</w:t>
-            </w:r>
-            <w:proofErr w:type="gramStart"/>
-            <w:r>
-              <w:t xml:space="preserve">Link]   </w:t>
-            </w:r>
-            <w:proofErr w:type="gramEnd"/>
-            <w:r>
-              <w:t xml:space="preserve"> </w:t>
+              <w:t xml:space="preserve"> [Link]    </w:t>
             </w:r>
           </w:p>
         </w:tc>
@@ -4275,36 +3931,20 @@
         <w:pStyle w:val="NoSpacing"/>
       </w:pPr>
       <w:r>
-        <w:t>**</w:t>
-      </w:r>
-      <w:proofErr w:type="gramStart"/>
-      <w:r>
-        <w:t>Goal:*</w:t>
-      </w:r>
-      <w:proofErr w:type="gramEnd"/>
-      <w:r>
-        <w:t>* Secure the best possible outcome from an offer while maintaining professionalism, protecting your leverage, and setting yourself up for a strong start — without burning bridges or risking the opportunity.</w:t>
-      </w:r>
-    </w:p>
-    <w:p>
-      <w:pPr>
-        <w:pStyle w:val="NoSpacing"/>
-      </w:pPr>
-    </w:p>
-    <w:p>
-      <w:pPr>
-        <w:pStyle w:val="NoSpacing"/>
-      </w:pPr>
-      <w:r>
-        <w:t xml:space="preserve">**Step-by-step checklist (follow this sequence once you receive an </w:t>
-      </w:r>
-      <w:proofErr w:type="gramStart"/>
-      <w:r>
-        <w:t>offer)*</w:t>
-      </w:r>
-      <w:proofErr w:type="gramEnd"/>
-      <w:r>
-        <w:t>*</w:t>
+        <w:t>**Goal:** Secure the best possible outcome from an offer while maintaining professionalism, protecting your leverage, and setting yourself up for a strong start — without burning bridges or risking the opportunity.</w:t>
+      </w:r>
+    </w:p>
+    <w:p>
+      <w:pPr>
+        <w:pStyle w:val="NoSpacing"/>
+      </w:pPr>
+    </w:p>
+    <w:p>
+      <w:pPr>
+        <w:pStyle w:val="NoSpacing"/>
+      </w:pPr>
+      <w:r>
+        <w:t>**Step-by-step checklist (follow this sequence once you receive an offer)**</w:t>
       </w:r>
     </w:p>
     <w:p>
@@ -4808,15 +4448,7 @@
               <w:pStyle w:val="NoSpacing"/>
             </w:pPr>
             <w:r>
-              <w:t xml:space="preserve"> [</w:t>
-            </w:r>
-            <w:proofErr w:type="gramStart"/>
-            <w:r>
-              <w:t xml:space="preserve">Link]   </w:t>
-            </w:r>
-            <w:proofErr w:type="gramEnd"/>
-            <w:r>
-              <w:t xml:space="preserve"> </w:t>
+              <w:t xml:space="preserve"> [Link]    </w:t>
             </w:r>
           </w:p>
         </w:tc>
@@ -4883,15 +4515,7 @@
               <w:pStyle w:val="NoSpacing"/>
             </w:pPr>
             <w:r>
-              <w:t xml:space="preserve"> [</w:t>
-            </w:r>
-            <w:proofErr w:type="gramStart"/>
-            <w:r>
-              <w:t xml:space="preserve">Link]   </w:t>
-            </w:r>
-            <w:proofErr w:type="gramEnd"/>
-            <w:r>
-              <w:t xml:space="preserve"> </w:t>
+              <w:t xml:space="preserve"> [Link]    </w:t>
             </w:r>
           </w:p>
         </w:tc>
@@ -4958,15 +4582,7 @@
               <w:pStyle w:val="NoSpacing"/>
             </w:pPr>
             <w:r>
-              <w:t xml:space="preserve"> [</w:t>
-            </w:r>
-            <w:proofErr w:type="gramStart"/>
-            <w:r>
-              <w:t xml:space="preserve">Link]   </w:t>
-            </w:r>
-            <w:proofErr w:type="gramEnd"/>
-            <w:r>
-              <w:t xml:space="preserve"> </w:t>
+              <w:t xml:space="preserve"> [Link]    </w:t>
             </w:r>
           </w:p>
         </w:tc>
@@ -5033,15 +4649,7 @@
               <w:pStyle w:val="NoSpacing"/>
             </w:pPr>
             <w:r>
-              <w:t xml:space="preserve"> [</w:t>
-            </w:r>
-            <w:proofErr w:type="gramStart"/>
-            <w:r>
-              <w:t xml:space="preserve">Link]   </w:t>
-            </w:r>
-            <w:proofErr w:type="gramEnd"/>
-            <w:r>
-              <w:t xml:space="preserve"> </w:t>
+              <w:t xml:space="preserve"> [Link]    </w:t>
             </w:r>
           </w:p>
         </w:tc>
@@ -5116,15 +4724,7 @@
               <w:pStyle w:val="NoSpacing"/>
             </w:pPr>
             <w:r>
-              <w:t xml:space="preserve"> [</w:t>
-            </w:r>
-            <w:proofErr w:type="gramStart"/>
-            <w:r>
-              <w:t xml:space="preserve">Link]   </w:t>
-            </w:r>
-            <w:proofErr w:type="gramEnd"/>
-            <w:r>
-              <w:t xml:space="preserve"> </w:t>
+              <w:t xml:space="preserve"> [Link]    </w:t>
             </w:r>
           </w:p>
         </w:tc>
@@ -5209,6 +4809,399 @@
       <w:pPr>
         <w:pStyle w:val="NoSpacing"/>
       </w:pPr>
+      <w:r>
+        <w:t>Good evening! No problem at all — we can keep this low-key tonight.</w:t>
+      </w:r>
+    </w:p>
+    <w:p>
+      <w:pPr>
+        <w:pStyle w:val="NoSpacing"/>
+      </w:pPr>
+    </w:p>
+    <w:p>
+      <w:pPr>
+        <w:pStyle w:val="NoSpacing"/>
+      </w:pPr>
+      <w:r>
+        <w:t>I've checked the repo (latest as of March 25, 2026). The four new/updated items you mentioned are now live:</w:t>
+      </w:r>
+    </w:p>
+    <w:p>
+      <w:pPr>
+        <w:pStyle w:val="NoSpacing"/>
+      </w:pPr>
+    </w:p>
+    <w:p>
+      <w:pPr>
+        <w:pStyle w:val="NoSpacing"/>
+      </w:pPr>
+      <w:r>
+        <w:t>- **Pre-Day-One Positioning Engine** (new, v2.0) — Post-acceptance / pre-start resource.</w:t>
+      </w:r>
+    </w:p>
+    <w:p>
+      <w:pPr>
+        <w:pStyle w:val="NoSpacing"/>
+      </w:pPr>
+      <w:r>
+        <w:t>- **Safe Offer Negotiation Assistant** (big update to v2.0) — Stronger total-comp analysis, scripts, pivot playbook, and risk checks.</w:t>
+      </w:r>
+    </w:p>
+    <w:p>
+      <w:pPr>
+        <w:pStyle w:val="NoSpacing"/>
+      </w:pPr>
+      <w:r>
+        <w:t>- **The Universal Interview Architect** (new/updated) — Powerful reverse-engineering tool for interview strategy.</w:t>
+      </w:r>
+    </w:p>
+    <w:p>
+      <w:pPr>
+        <w:pStyle w:val="NoSpacing"/>
+      </w:pPr>
+      <w:r>
+        <w:t>- **The Universal Interview Architect - Usage Guide** (new) — Includes persona-specific queries, sample prompts, and best practices.</w:t>
+      </w:r>
+    </w:p>
+    <w:p>
+      <w:pPr>
+        <w:pStyle w:val="NoSpacing"/>
+      </w:pPr>
+    </w:p>
+    <w:p>
+      <w:pPr>
+        <w:pStyle w:val="NoSpacing"/>
+      </w:pPr>
+      <w:r>
+        <w:t>These fit cleanly into the existing structure of your playbook.</w:t>
+      </w:r>
+    </w:p>
+    <w:p>
+      <w:pPr>
+        <w:pStyle w:val="NoSpacing"/>
+      </w:pPr>
+    </w:p>
+    <w:p>
+      <w:pPr>
+        <w:pStyle w:val="NoSpacing"/>
+      </w:pPr>
+      <w:r>
+        <w:t>### Recommended Placement for the New Prompts</w:t>
+      </w:r>
+    </w:p>
+    <w:p>
+      <w:pPr>
+        <w:pStyle w:val="NoSpacing"/>
+      </w:pPr>
+      <w:r>
+        <w:t>Here's where they belong (ready for you to paste later):</w:t>
+      </w:r>
+    </w:p>
+    <w:p>
+      <w:pPr>
+        <w:pStyle w:val="NoSpacing"/>
+      </w:pPr>
+    </w:p>
+    <w:p>
+      <w:pPr>
+        <w:pStyle w:val="NoSpacing"/>
+      </w:pPr>
+      <w:r>
+        <w:t xml:space="preserve">1. **The Universal Interview Architect** + **Usage Guide**  </w:t>
+      </w:r>
+    </w:p>
+    <w:p>
+      <w:pPr>
+        <w:pStyle w:val="NoSpacing"/>
+      </w:pPr>
+      <w:r>
+        <w:t xml:space="preserve">   → Add to **Phase 3: During – Part 2 (Interview Preparation &amp; Resilience)**  </w:t>
+      </w:r>
+    </w:p>
+    <w:p>
+      <w:pPr>
+        <w:pStyle w:val="NoSpacing"/>
+      </w:pPr>
+      <w:r>
+        <w:t xml:space="preserve">   Best spot: After "Pre-Interview Intelligence Dossier" or as a new major tool in the checklist/step 1 (pre-interview intel &amp; alignment).  </w:t>
+      </w:r>
+    </w:p>
+    <w:p>
+      <w:pPr>
+        <w:pStyle w:val="NoSpacing"/>
+      </w:pPr>
+      <w:r>
+        <w:t xml:space="preserve">   **Why**: It synthesizes the job posting, master profile, and intel into a full interview strategy. The Usage Guide makes it even more powerful.</w:t>
+      </w:r>
+    </w:p>
+    <w:p>
+      <w:pPr>
+        <w:pStyle w:val="NoSpacing"/>
+      </w:pPr>
+    </w:p>
+    <w:p>
+      <w:pPr>
+        <w:pStyle w:val="NoSpacing"/>
+      </w:pPr>
+      <w:r>
+        <w:t xml:space="preserve">2. **Safe Offer Negotiation Assistant** (updated)  </w:t>
+      </w:r>
+    </w:p>
+    <w:p>
+      <w:pPr>
+        <w:pStyle w:val="NoSpacing"/>
+      </w:pPr>
+      <w:r>
+        <w:t xml:space="preserve">   → Already in **Phase 4: After – Offer, Negotiation &amp; Close**  </w:t>
+      </w:r>
+    </w:p>
+    <w:p>
+      <w:pPr>
+        <w:pStyle w:val="NoSpacing"/>
+      </w:pPr>
+      <w:r>
+        <w:t xml:space="preserve">   Just strengthen its description in the table/checklist to reflect the v2.0 upgrades (better total-comp calculation, dry powder, pivot playbook, adversarial red-teaming).</w:t>
+      </w:r>
+    </w:p>
+    <w:p>
+      <w:pPr>
+        <w:pStyle w:val="NoSpacing"/>
+      </w:pPr>
+    </w:p>
+    <w:p>
+      <w:pPr>
+        <w:pStyle w:val="NoSpacing"/>
+      </w:pPr>
+      <w:r>
+        <w:t xml:space="preserve">3. **Pre-Day-One Positioning Engine**  </w:t>
+      </w:r>
+    </w:p>
+    <w:p>
+      <w:pPr>
+        <w:pStyle w:val="NoSpacing"/>
+      </w:pPr>
+      <w:r>
+        <w:t xml:space="preserve">   → Add to **Phase 4: After – Offer, Negotiation &amp; Close**, right after acceptance (in step 4 "Accept &amp; onboard prep").  </w:t>
+      </w:r>
+    </w:p>
+    <w:p>
+      <w:pPr>
+        <w:pStyle w:val="NoSpacing"/>
+      </w:pPr>
+      <w:r>
+        <w:t xml:space="preserve">   **Why**: It's explicitly a post-accept / pre-Day-One tool for building stakeholder maps, early wins, risk scans, and a 30-day plan.</w:t>
+      </w:r>
+    </w:p>
+    <w:p>
+      <w:pPr>
+        <w:pStyle w:val="NoSpacing"/>
+      </w:pPr>
+    </w:p>
+    <w:p>
+      <w:pPr>
+        <w:pStyle w:val="NoSpacing"/>
+      </w:pPr>
+      <w:r>
+        <w:t>### Ready-to-Paste Additions (Copy When You Have Time)</w:t>
+      </w:r>
+    </w:p>
+    <w:p>
+      <w:pPr>
+        <w:pStyle w:val="NoSpacing"/>
+      </w:pPr>
+      <w:r>
+        <w:t>Here are clean blocks you can paste directly into the appropriate phases tonight (or tomorrow). I'll keep them concise so they slot in easily.</w:t>
+      </w:r>
+    </w:p>
+    <w:p>
+      <w:pPr>
+        <w:pStyle w:val="NoSpacing"/>
+      </w:pPr>
+    </w:p>
+    <w:p>
+      <w:pPr>
+        <w:pStyle w:val="NoSpacing"/>
+      </w:pPr>
+      <w:r>
+        <w:t>#### For Phase 3 – Add this under the checklist (new step or expand step 1):</w:t>
+      </w:r>
+    </w:p>
+    <w:p>
+      <w:pPr>
+        <w:pStyle w:val="NoSpacing"/>
+      </w:pPr>
+    </w:p>
+    <w:p>
+      <w:pPr>
+        <w:pStyle w:val="NoSpacing"/>
+      </w:pPr>
+      <w:r>
+        <w:t xml:space="preserve">**New Tool – The Universal Interview Architect (with Usage Guide)**  </w:t>
+      </w:r>
+    </w:p>
+    <w:p>
+      <w:pPr>
+        <w:pStyle w:val="NoSpacing"/>
+      </w:pPr>
+      <w:r>
+        <w:t xml:space="preserve">Run **The Universal Interview Architect** using your Master-Career-Profile, the job posting, and pre-interview intel.  </w:t>
+      </w:r>
+    </w:p>
+    <w:p>
+      <w:pPr>
+        <w:pStyle w:val="NoSpacing"/>
+      </w:pPr>
+      <w:r>
+        <w:lastRenderedPageBreak/>
+        <w:t xml:space="preserve">Use the companion **Usage Guide** for persona-specific queries, sample prompts, and best practices (e.g., 90-second connection statements, Power Shift questions, Reality Gap framing).  </w:t>
+      </w:r>
+    </w:p>
+    <w:p>
+      <w:pPr>
+        <w:pStyle w:val="NoSpacing"/>
+      </w:pPr>
+    </w:p>
+    <w:p>
+      <w:pPr>
+        <w:pStyle w:val="NoSpacing"/>
+      </w:pPr>
+      <w:r>
+        <w:t>**Value**: Turns raw intel into a tailored, evidence-based interview strategy that uncovers unwritten rules, interviewer personas, and hidden company anxieties.</w:t>
+      </w:r>
+    </w:p>
+    <w:p>
+      <w:pPr>
+        <w:pStyle w:val="NoSpacing"/>
+      </w:pPr>
+    </w:p>
+    <w:p>
+      <w:pPr>
+        <w:pStyle w:val="NoSpacing"/>
+      </w:pPr>
+      <w:r>
+        <w:t>#### For Phase 4 – Update/expand the Safe Offer Negotiation Assistant row in the table:</w:t>
+      </w:r>
+    </w:p>
+    <w:p>
+      <w:pPr>
+        <w:pStyle w:val="NoSpacing"/>
+      </w:pPr>
+    </w:p>
+    <w:p>
+      <w:pPr>
+        <w:pStyle w:val="NoSpacing"/>
+      </w:pPr>
+      <w:r>
+        <w:t xml:space="preserve">Change the description to:  </w:t>
+      </w:r>
+    </w:p>
+    <w:p>
+      <w:pPr>
+        <w:pStyle w:val="NoSpacing"/>
+      </w:pPr>
+      <w:r>
+        <w:t>"Generates ethical, low-risk negotiation strategies with total-comp analysis ('Dry Powder'), pivot playbook, and vulnerability patches (v2.0 update)."</w:t>
+      </w:r>
+    </w:p>
+    <w:p>
+      <w:pPr>
+        <w:pStyle w:val="NoSpacing"/>
+      </w:pPr>
+    </w:p>
+    <w:p>
+      <w:pPr>
+        <w:pStyle w:val="NoSpacing"/>
+      </w:pPr>
+      <w:r>
+        <w:t>#### For Phase 4 – Add this new item to the checklist (after acceptance):</w:t>
+      </w:r>
+    </w:p>
+    <w:p>
+      <w:pPr>
+        <w:pStyle w:val="NoSpacing"/>
+      </w:pPr>
+    </w:p>
+    <w:p>
+      <w:pPr>
+        <w:pStyle w:val="NoSpacing"/>
+      </w:pPr>
+      <w:r>
+        <w:t xml:space="preserve">**Post-Acceptance Positioning**  </w:t>
+      </w:r>
+    </w:p>
+    <w:p>
+      <w:pPr>
+        <w:pStyle w:val="NoSpacing"/>
+      </w:pPr>
+      <w:r>
+        <w:t xml:space="preserve">Run **Pre-Day-One Positioning Engine** (PDPE) using the original job posting + interview intel.  </w:t>
+      </w:r>
+    </w:p>
+    <w:p>
+      <w:pPr>
+        <w:pStyle w:val="NoSpacing"/>
+      </w:pPr>
+      <w:r>
+        <w:t xml:space="preserve">It builds a stakeholder map, risk/landmine scan, early-win calculator, and 30-day offensive plan (including a ready-to-use DAY 0 BRIEF).  </w:t>
+      </w:r>
+    </w:p>
+    <w:p>
+      <w:pPr>
+        <w:pStyle w:val="NoSpacing"/>
+      </w:pPr>
+    </w:p>
+    <w:p>
+      <w:pPr>
+        <w:pStyle w:val="NoSpacing"/>
+      </w:pPr>
+      <w:r>
+        <w:t>**Value**: Transforms you from "new hire" to high-impact contributor from Day One by addressing political risks and identifying quick wins.</w:t>
+      </w:r>
+    </w:p>
+    <w:p>
+      <w:pPr>
+        <w:pStyle w:val="NoSpacing"/>
+      </w:pPr>
+    </w:p>
+    <w:p>
+      <w:pPr>
+        <w:pStyle w:val="NoSpacing"/>
+      </w:pPr>
+      <w:r>
+        <w:t xml:space="preserve">Would you like me to prepare full updated table rows or a short "Recent Updates" section at the end of the doc for these new prompts?  </w:t>
+      </w:r>
+    </w:p>
+    <w:p>
+      <w:pPr>
+        <w:pStyle w:val="NoSpacing"/>
+      </w:pPr>
+    </w:p>
+    <w:p>
+      <w:pPr>
+        <w:pStyle w:val="NoSpacing"/>
+      </w:pPr>
+      <w:r>
+        <w:t>Just paste whatever you want to add tonight (or say "add these four with the placements above"), and tomorrow we can continue formatting the tables, sidebars, TOC refresh, etc.</w:t>
+      </w:r>
+    </w:p>
+    <w:p>
+      <w:pPr>
+        <w:pStyle w:val="NoSpacing"/>
+      </w:pPr>
+    </w:p>
+    <w:p>
+      <w:pPr>
+        <w:pStyle w:val="NoSpacing"/>
+      </w:pPr>
+      <w:r>
+        <w:t xml:space="preserve">Rest up — let me know when you're ready to pick this back up. </w:t>
+      </w:r>
+      <w:r>
+        <w:rPr>
+          <w:rFonts w:ascii="Segoe UI Emoji" w:hAnsi="Segoe UI Emoji" w:cs="Segoe UI Emoji"/>
+        </w:rPr>
+        <w:t>🚀</w:t>
+      </w:r>
     </w:p>
     <w:sectPr>
       <w:headerReference w:type="default" r:id="rId6"/>

</xml_diff>

<commit_message>
Renamed a file and updated the playbook document
</commit_message>
<xml_diff>
--- a/Job seeker's playbook.docx
+++ b/Job seeker's playbook.docx
@@ -59,6 +59,15 @@
     </w:p>
     <w:sdt>
       <w:sdtPr>
+        <w:rPr>
+          <w:rFonts w:asciiTheme="minorHAnsi" w:eastAsiaTheme="minorHAnsi" w:hAnsiTheme="minorHAnsi" w:cstheme="minorBidi"/>
+          <w:color w:val="auto"/>
+          <w:kern w:val="2"/>
+          <w:sz w:val="22"/>
+          <w:szCs w:val="22"/>
+          <w:lang w:val="en-GB"/>
+          <w14:ligatures w14:val="standardContextual"/>
+        </w:rPr>
         <w:id w:val="456224513"/>
         <w:docPartObj>
           <w:docPartGallery w:val="Table of Contents"/>
@@ -67,16 +76,9 @@
       </w:sdtPr>
       <w:sdtEndPr>
         <w:rPr>
-          <w:rFonts w:asciiTheme="minorHAnsi" w:eastAsiaTheme="minorHAnsi" w:hAnsiTheme="minorHAnsi" w:cstheme="minorBidi"/>
           <w:b/>
           <w:bCs/>
           <w:noProof/>
-          <w:color w:val="auto"/>
-          <w:kern w:val="2"/>
-          <w:sz w:val="22"/>
-          <w:szCs w:val="22"/>
-          <w:lang w:val="en-GB"/>
-          <w14:ligatures w14:val="standardContextual"/>
         </w:rPr>
       </w:sdtEndPr>
       <w:sdtContent>
@@ -2267,15 +2269,7 @@
         <w:ind w:left="720"/>
       </w:pPr>
       <w:r>
-        <w:t xml:space="preserve">Along the way, I experimented heavily with AI tools. I found that most generic advice and off-the-shelf prompts either hallucinated details or encouraged risky shortcuts. </w:t>
-      </w:r>
-      <w:proofErr w:type="gramStart"/>
-      <w:r>
-        <w:t>So</w:t>
-      </w:r>
-      <w:proofErr w:type="gramEnd"/>
-      <w:r>
-        <w:t xml:space="preserve"> I started building something different:</w:t>
+        <w:t>Along the way, I experimented heavily with AI tools. I found that most generic advice and off-the-shelf prompts either hallucinated details or encouraged risky shortcuts. So I started building something different:</w:t>
       </w:r>
       <w:r>
         <w:t xml:space="preserve"> a disciplined, integrity-first system grounded in the same security and verification principles I use in cybersecurity.</w:t>
@@ -2716,20 +2710,12 @@
         <w:pStyle w:val="NoSpacing"/>
       </w:pPr>
       <w:r>
-        <w:t xml:space="preserve">- Apply the same risk-detection mindset you use in cybersecurity to every job posting, company, and </w:t>
-      </w:r>
-      <w:proofErr w:type="gramStart"/>
-      <w:r>
-        <w:t xml:space="preserve">offer  </w:t>
+        <w:t xml:space="preserve">- Apply the same risk-detection mindset you use in cybersecurity to every job posting, company, and offer  </w:t>
       </w:r>
       <w:bookmarkStart w:id="16" w:name="_Toc225447841"/>
       <w:bookmarkStart w:id="17" w:name="_Toc225447869"/>
       <w:r>
-        <w:t>Phase</w:t>
-      </w:r>
-      <w:proofErr w:type="gramEnd"/>
-      <w:r>
-        <w:t xml:space="preserve"> 0:</w:t>
+        <w:t>Phase 0:</w:t>
       </w:r>
       <w:r>
         <w:t xml:space="preserve"> Core Career Data Workflow (Do This First – Non-Negotiable)</w:t>
@@ -3021,60 +3007,65 @@
                 <w:b/>
                 <w:bCs/>
               </w:rPr>
-              <w:t>Approx. Daily Limits (</w:t>
-            </w:r>
-            <w:proofErr w:type="gramStart"/>
-            <w:r>
+              <w:t xml:space="preserve">Approx. Daily Limits (Free)                  </w:t>
+            </w:r>
+          </w:p>
+        </w:tc>
+        <w:tc>
+          <w:tcPr>
+            <w:tcW w:w="1288" w:type="dxa"/>
+          </w:tcPr>
+          <w:p>
+            <w:pPr>
+              <w:pStyle w:val="NoSpacing"/>
               <w:rPr>
                 <w:b/>
                 <w:bCs/>
               </w:rPr>
-              <w:t xml:space="preserve">Free)   </w:t>
-            </w:r>
-            <w:proofErr w:type="gramEnd"/>
+            </w:pPr>
             <w:r>
               <w:rPr>
                 <w:b/>
                 <w:bCs/>
               </w:rPr>
-              <w:t xml:space="preserve">               </w:t>
-            </w:r>
-          </w:p>
-        </w:tc>
-        <w:tc>
-          <w:tcPr>
-            <w:tcW w:w="1288" w:type="dxa"/>
-          </w:tcPr>
-          <w:p>
-            <w:pPr>
-              <w:pStyle w:val="NoSpacing"/>
+              <w:t xml:space="preserve">Projects / </w:t>
+            </w:r>
+            <w:proofErr w:type="spellStart"/>
+            <w:r>
               <w:rPr>
                 <w:b/>
                 <w:bCs/>
               </w:rPr>
-            </w:pPr>
+              <w:t>Workareas</w:t>
+            </w:r>
+            <w:proofErr w:type="spellEnd"/>
             <w:r>
               <w:rPr>
                 <w:b/>
                 <w:bCs/>
               </w:rPr>
-              <w:t xml:space="preserve">Projects / </w:t>
-            </w:r>
-            <w:proofErr w:type="spellStart"/>
-            <w:r>
+              <w:t xml:space="preserve">?          </w:t>
+            </w:r>
+          </w:p>
+        </w:tc>
+        <w:tc>
+          <w:tcPr>
+            <w:tcW w:w="1288" w:type="dxa"/>
+          </w:tcPr>
+          <w:p>
+            <w:pPr>
+              <w:pStyle w:val="NoSpacing"/>
               <w:rPr>
                 <w:b/>
                 <w:bCs/>
               </w:rPr>
-              <w:t>Workareas</w:t>
-            </w:r>
-            <w:proofErr w:type="spellEnd"/>
+            </w:pPr>
             <w:r>
               <w:rPr>
                 <w:b/>
                 <w:bCs/>
               </w:rPr>
-              <w:t xml:space="preserve">?          </w:t>
+              <w:t xml:space="preserve">Key Strengths for Job Search                          </w:t>
             </w:r>
           </w:p>
         </w:tc>
@@ -3095,7 +3086,7 @@
                 <w:b/>
                 <w:bCs/>
               </w:rPr>
-              <w:t xml:space="preserve">Key Strengths for Job Search                          </w:t>
+              <w:t xml:space="preserve">Main Weaknesses                              </w:t>
             </w:r>
           </w:p>
         </w:tc>
@@ -3116,27 +3107,6 @@
                 <w:b/>
                 <w:bCs/>
               </w:rPr>
-              <w:t xml:space="preserve">Main Weaknesses                              </w:t>
-            </w:r>
-          </w:p>
-        </w:tc>
-        <w:tc>
-          <w:tcPr>
-            <w:tcW w:w="1288" w:type="dxa"/>
-          </w:tcPr>
-          <w:p>
-            <w:pPr>
-              <w:pStyle w:val="NoSpacing"/>
-              <w:rPr>
-                <w:b/>
-                <w:bCs/>
-              </w:rPr>
-            </w:pPr>
-            <w:r>
-              <w:rPr>
-                <w:b/>
-                <w:bCs/>
-              </w:rPr>
               <w:t xml:space="preserve">Best For                                      </w:t>
             </w:r>
           </w:p>
@@ -3155,17 +3125,12 @@
               <w:t>Grok (</w:t>
             </w:r>
             <w:proofErr w:type="spellStart"/>
-            <w:proofErr w:type="gramStart"/>
             <w:r>
               <w:t>xAI</w:t>
             </w:r>
             <w:proofErr w:type="spellEnd"/>
             <w:r>
-              <w:t xml:space="preserve">)   </w:t>
-            </w:r>
-            <w:proofErr w:type="gramEnd"/>
-            <w:r>
-              <w:t xml:space="preserve">  </w:t>
+              <w:t xml:space="preserve">)     </w:t>
             </w:r>
           </w:p>
         </w:tc>
@@ -3191,15 +3156,7 @@
               <w:pStyle w:val="NoSpacing"/>
             </w:pPr>
             <w:r>
-              <w:t>~10–20 messages per few hours (</w:t>
-            </w:r>
-            <w:proofErr w:type="gramStart"/>
-            <w:r>
-              <w:t xml:space="preserve">varies)   </w:t>
-            </w:r>
-            <w:proofErr w:type="gramEnd"/>
-            <w:r>
-              <w:t xml:space="preserve">   </w:t>
+              <w:t xml:space="preserve">~10–20 messages per few hours (varies)      </w:t>
             </w:r>
           </w:p>
         </w:tc>
@@ -3434,15 +3391,7 @@
               <w:pStyle w:val="NoSpacing"/>
             </w:pPr>
             <w:r>
-              <w:t xml:space="preserve">Hits </w:t>
-            </w:r>
-            <w:proofErr w:type="gramStart"/>
-            <w:r>
-              <w:t>limits</w:t>
-            </w:r>
-            <w:proofErr w:type="gramEnd"/>
-            <w:r>
-              <w:t xml:space="preserve"> fastest, frequent downgrades     </w:t>
+              <w:t xml:space="preserve">Hits limits fastest, frequent downgrades     </w:t>
             </w:r>
           </w:p>
         </w:tc>
@@ -3496,15 +3445,7 @@
               <w:pStyle w:val="NoSpacing"/>
             </w:pPr>
             <w:r>
-              <w:t>30–100+ messages/day (</w:t>
-            </w:r>
-            <w:proofErr w:type="gramStart"/>
-            <w:r>
-              <w:t xml:space="preserve">dynamic)   </w:t>
-            </w:r>
-            <w:proofErr w:type="gramEnd"/>
-            <w:r>
-              <w:t xml:space="preserve">           </w:t>
+              <w:t xml:space="preserve">30–100+ messages/day (dynamic)              </w:t>
             </w:r>
           </w:p>
         </w:tc>
@@ -3605,15 +3546,7 @@
               <w:pStyle w:val="NoSpacing"/>
             </w:pPr>
             <w:r>
-              <w:t xml:space="preserve">Decent daily limits (Microsoft </w:t>
-            </w:r>
-            <w:proofErr w:type="gramStart"/>
-            <w:r>
-              <w:t xml:space="preserve">account)   </w:t>
-            </w:r>
-            <w:proofErr w:type="gramEnd"/>
-            <w:r>
-              <w:t xml:space="preserve">  </w:t>
+              <w:t xml:space="preserve">Decent daily limits (Microsoft account)     </w:t>
             </w:r>
           </w:p>
         </w:tc>
@@ -3890,15 +3823,7 @@
       </w:r>
       <w:proofErr w:type="spellEnd"/>
       <w:r>
-        <w:t xml:space="preserve"> range) for the engine you like most. One paid subscription + two free engines usually </w:t>
-      </w:r>
-      <w:proofErr w:type="gramStart"/>
-      <w:r>
-        <w:t>gives</w:t>
-      </w:r>
-      <w:proofErr w:type="gramEnd"/>
-      <w:r>
-        <w:t xml:space="preserve"> unlimited effective capacity.</w:t>
+        <w:t xml:space="preserve"> range) for the engine you like most. One paid subscription + two free engines usually gives unlimited effective capacity.</w:t>
       </w:r>
     </w:p>
     <w:p>
@@ -4684,16 +4609,16 @@
             <w:pPr>
               <w:pStyle w:val="NoSpacing"/>
             </w:pPr>
-            <w:r>
-              <w:t>[</w:t>
-            </w:r>
-            <w:proofErr w:type="gramStart"/>
-            <w:r>
-              <w:t xml:space="preserve">Link]   </w:t>
-            </w:r>
-            <w:proofErr w:type="gramEnd"/>
-            <w:r>
-              <w:t xml:space="preserve">                  </w:t>
+            <w:hyperlink r:id="rId8" w:history="1">
+              <w:r>
+                <w:rPr>
+                  <w:rStyle w:val="Hyperlink"/>
+                </w:rPr>
+                <w:t xml:space="preserve">[Link]                    </w:t>
+              </w:r>
+            </w:hyperlink>
+            <w:r>
+              <w:t xml:space="preserve"> </w:t>
             </w:r>
           </w:p>
         </w:tc>
@@ -4759,16 +4684,16 @@
             <w:pPr>
               <w:pStyle w:val="NoSpacing"/>
             </w:pPr>
-            <w:r>
-              <w:t>[</w:t>
-            </w:r>
-            <w:proofErr w:type="gramStart"/>
-            <w:r>
-              <w:t xml:space="preserve">Link]   </w:t>
-            </w:r>
-            <w:proofErr w:type="gramEnd"/>
-            <w:r>
-              <w:t xml:space="preserve">                  </w:t>
+            <w:hyperlink r:id="rId9" w:history="1">
+              <w:r>
+                <w:rPr>
+                  <w:rStyle w:val="Hyperlink"/>
+                </w:rPr>
+                <w:t xml:space="preserve">[Link]                    </w:t>
+              </w:r>
+            </w:hyperlink>
+            <w:r>
+              <w:t xml:space="preserve"> </w:t>
             </w:r>
           </w:p>
         </w:tc>
@@ -4834,16 +4759,16 @@
             <w:pPr>
               <w:pStyle w:val="NoSpacing"/>
             </w:pPr>
-            <w:r>
-              <w:t>[</w:t>
-            </w:r>
-            <w:proofErr w:type="gramStart"/>
-            <w:r>
-              <w:t xml:space="preserve">Link]   </w:t>
-            </w:r>
-            <w:proofErr w:type="gramEnd"/>
-            <w:r>
-              <w:t xml:space="preserve">                  </w:t>
+            <w:hyperlink r:id="rId10" w:history="1">
+              <w:r>
+                <w:rPr>
+                  <w:rStyle w:val="Hyperlink"/>
+                </w:rPr>
+                <w:t xml:space="preserve">[Link]                    </w:t>
+              </w:r>
+            </w:hyperlink>
+            <w:r>
+              <w:t xml:space="preserve"> </w:t>
             </w:r>
           </w:p>
         </w:tc>
@@ -4909,16 +4834,16 @@
             <w:pPr>
               <w:pStyle w:val="NoSpacing"/>
             </w:pPr>
-            <w:r>
-              <w:t>[</w:t>
-            </w:r>
-            <w:proofErr w:type="gramStart"/>
-            <w:r>
-              <w:t xml:space="preserve">Link]   </w:t>
-            </w:r>
-            <w:proofErr w:type="gramEnd"/>
-            <w:r>
-              <w:t xml:space="preserve">                  </w:t>
+            <w:hyperlink r:id="rId11" w:history="1">
+              <w:r>
+                <w:rPr>
+                  <w:rStyle w:val="Hyperlink"/>
+                </w:rPr>
+                <w:t xml:space="preserve">[Link]                    </w:t>
+              </w:r>
+            </w:hyperlink>
+            <w:r>
+              <w:t xml:space="preserve"> </w:t>
             </w:r>
           </w:p>
         </w:tc>
@@ -4984,16 +4909,16 @@
             <w:pPr>
               <w:pStyle w:val="NoSpacing"/>
             </w:pPr>
-            <w:r>
-              <w:t>[</w:t>
-            </w:r>
-            <w:proofErr w:type="gramStart"/>
-            <w:r>
-              <w:t xml:space="preserve">Link]   </w:t>
-            </w:r>
-            <w:proofErr w:type="gramEnd"/>
-            <w:r>
-              <w:t xml:space="preserve">                  </w:t>
+            <w:hyperlink r:id="rId12" w:history="1">
+              <w:r>
+                <w:rPr>
+                  <w:rStyle w:val="Hyperlink"/>
+                </w:rPr>
+                <w:t xml:space="preserve">[Link]                    </w:t>
+              </w:r>
+            </w:hyperlink>
+            <w:r>
+              <w:t xml:space="preserve"> </w:t>
             </w:r>
           </w:p>
         </w:tc>
@@ -5059,16 +4984,16 @@
             <w:pPr>
               <w:pStyle w:val="NoSpacing"/>
             </w:pPr>
-            <w:r>
-              <w:t>[</w:t>
-            </w:r>
-            <w:proofErr w:type="gramStart"/>
-            <w:r>
-              <w:t xml:space="preserve">Link]   </w:t>
-            </w:r>
-            <w:proofErr w:type="gramEnd"/>
-            <w:r>
-              <w:t xml:space="preserve">                  </w:t>
+            <w:hyperlink r:id="rId13" w:history="1">
+              <w:r>
+                <w:rPr>
+                  <w:rStyle w:val="Hyperlink"/>
+                </w:rPr>
+                <w:t xml:space="preserve">[Link]                    </w:t>
+              </w:r>
+            </w:hyperlink>
+            <w:r>
+              <w:t xml:space="preserve"> </w:t>
             </w:r>
           </w:p>
         </w:tc>
@@ -5083,15 +5008,13 @@
               <w:pStyle w:val="NoSpacing"/>
             </w:pPr>
             <w:r>
-              <w:t xml:space="preserve">Job posting red flag </w:t>
-            </w:r>
-            <w:proofErr w:type="spellStart"/>
-            <w:r>
-              <w:t>analyzer</w:t>
-            </w:r>
-            <w:proofErr w:type="spellEnd"/>
-            <w:r>
-              <w:t xml:space="preserve">              </w:t>
+              <w:t>Job posting red flag analy</w:t>
+            </w:r>
+            <w:r>
+              <w:t>s</w:t>
+            </w:r>
+            <w:r>
+              <w:t xml:space="preserve">er              </w:t>
             </w:r>
           </w:p>
         </w:tc>
@@ -5104,15 +5027,7 @@
               <w:pStyle w:val="NoSpacing"/>
             </w:pPr>
             <w:r>
-              <w:t>Before clicking “</w:t>
-            </w:r>
-            <w:proofErr w:type="gramStart"/>
-            <w:r>
-              <w:t xml:space="preserve">Apply”   </w:t>
-            </w:r>
-            <w:proofErr w:type="gramEnd"/>
-            <w:r>
-              <w:t xml:space="preserve">   </w:t>
+              <w:t xml:space="preserve">Before clicking “Apply”      </w:t>
             </w:r>
           </w:p>
         </w:tc>
@@ -5151,15 +5066,7 @@
               <w:pStyle w:val="NoSpacing"/>
             </w:pPr>
             <w:r>
-              <w:t>[</w:t>
-            </w:r>
-            <w:proofErr w:type="gramStart"/>
-            <w:r>
-              <w:t xml:space="preserve">Link]   </w:t>
-            </w:r>
-            <w:proofErr w:type="gramEnd"/>
-            <w:r>
-              <w:t xml:space="preserve">                  </w:t>
+              <w:t xml:space="preserve">[Link]                     </w:t>
             </w:r>
           </w:p>
         </w:tc>
@@ -5231,15 +5138,7 @@
               <w:pStyle w:val="NoSpacing"/>
             </w:pPr>
             <w:r>
-              <w:t>[</w:t>
-            </w:r>
-            <w:proofErr w:type="gramStart"/>
-            <w:r>
-              <w:t xml:space="preserve">Link]   </w:t>
-            </w:r>
-            <w:proofErr w:type="gramEnd"/>
-            <w:r>
-              <w:t xml:space="preserve">                  </w:t>
+              <w:t xml:space="preserve">[Link]                     </w:t>
             </w:r>
           </w:p>
         </w:tc>
@@ -5390,15 +5289,7 @@
         <w:pStyle w:val="NoSpacing"/>
       </w:pPr>
       <w:r>
-        <w:t xml:space="preserve">   - Supplement with manual searches on LinkedIn, company career pages, </w:t>
-      </w:r>
-      <w:proofErr w:type="gramStart"/>
-      <w:r>
-        <w:t>Indeed</w:t>
-      </w:r>
-      <w:proofErr w:type="gramEnd"/>
-      <w:r>
-        <w:t xml:space="preserve">, etc.  </w:t>
+        <w:t xml:space="preserve">   - Supplement with manual searches on LinkedIn, company career pages, Indeed, etc.  </w:t>
       </w:r>
     </w:p>
     <w:p>
@@ -5894,15 +5785,7 @@
               <w:pStyle w:val="NoSpacing"/>
             </w:pPr>
             <w:r>
-              <w:t xml:space="preserve">Ongoing (set &amp; </w:t>
-            </w:r>
-            <w:proofErr w:type="gramStart"/>
-            <w:r>
-              <w:t xml:space="preserve">forget)   </w:t>
-            </w:r>
-            <w:proofErr w:type="gramEnd"/>
-            <w:r>
-              <w:t xml:space="preserve">            </w:t>
+              <w:t xml:space="preserve">Ongoing (set &amp; forget)               </w:t>
             </w:r>
           </w:p>
         </w:tc>
@@ -5941,15 +5824,7 @@
               <w:pStyle w:val="NoSpacing"/>
             </w:pPr>
             <w:r>
-              <w:t>[</w:t>
-            </w:r>
-            <w:proofErr w:type="gramStart"/>
-            <w:r>
-              <w:t xml:space="preserve">Link]   </w:t>
-            </w:r>
-            <w:proofErr w:type="gramEnd"/>
-            <w:r>
-              <w:t xml:space="preserve"> </w:t>
+              <w:t xml:space="preserve">[Link]    </w:t>
             </w:r>
           </w:p>
         </w:tc>
@@ -6019,15 +5894,7 @@
               <w:pStyle w:val="NoSpacing"/>
             </w:pPr>
             <w:r>
-              <w:t>[</w:t>
-            </w:r>
-            <w:proofErr w:type="gramStart"/>
-            <w:r>
-              <w:t xml:space="preserve">Link]   </w:t>
-            </w:r>
-            <w:proofErr w:type="gramEnd"/>
-            <w:r>
-              <w:t xml:space="preserve"> </w:t>
+              <w:t xml:space="preserve">[Link]    </w:t>
             </w:r>
           </w:p>
         </w:tc>
@@ -6098,15 +5965,7 @@
               <w:pStyle w:val="NoSpacing"/>
             </w:pPr>
             <w:r>
-              <w:t>[</w:t>
-            </w:r>
-            <w:proofErr w:type="gramStart"/>
-            <w:r>
-              <w:t xml:space="preserve">Link]   </w:t>
-            </w:r>
-            <w:proofErr w:type="gramEnd"/>
-            <w:r>
-              <w:t xml:space="preserve"> </w:t>
+              <w:t xml:space="preserve">[Link]    </w:t>
             </w:r>
           </w:p>
         </w:tc>
@@ -6176,15 +6035,7 @@
               <w:pStyle w:val="NoSpacing"/>
             </w:pPr>
             <w:r>
-              <w:t>[</w:t>
-            </w:r>
-            <w:proofErr w:type="gramStart"/>
-            <w:r>
-              <w:t xml:space="preserve">Link]   </w:t>
-            </w:r>
-            <w:proofErr w:type="gramEnd"/>
-            <w:r>
-              <w:t xml:space="preserve"> </w:t>
+              <w:t xml:space="preserve">[Link]    </w:t>
             </w:r>
           </w:p>
         </w:tc>
@@ -6262,15 +6113,7 @@
               <w:pStyle w:val="NoSpacing"/>
             </w:pPr>
             <w:r>
-              <w:t>[</w:t>
-            </w:r>
-            <w:proofErr w:type="gramStart"/>
-            <w:r>
-              <w:t xml:space="preserve">Link]   </w:t>
-            </w:r>
-            <w:proofErr w:type="gramEnd"/>
-            <w:r>
-              <w:t xml:space="preserve"> </w:t>
+              <w:t xml:space="preserve">[Link]    </w:t>
             </w:r>
           </w:p>
         </w:tc>
@@ -6340,15 +6183,7 @@
               <w:pStyle w:val="NoSpacing"/>
             </w:pPr>
             <w:r>
-              <w:t>[</w:t>
-            </w:r>
-            <w:proofErr w:type="gramStart"/>
-            <w:r>
-              <w:t xml:space="preserve">Link]   </w:t>
-            </w:r>
-            <w:proofErr w:type="gramEnd"/>
-            <w:r>
-              <w:t xml:space="preserve"> </w:t>
+              <w:t xml:space="preserve">[Link]    </w:t>
             </w:r>
           </w:p>
         </w:tc>
@@ -6418,15 +6253,7 @@
               <w:pStyle w:val="NoSpacing"/>
             </w:pPr>
             <w:r>
-              <w:t>[</w:t>
-            </w:r>
-            <w:proofErr w:type="gramStart"/>
-            <w:r>
-              <w:t xml:space="preserve">Link]   </w:t>
-            </w:r>
-            <w:proofErr w:type="gramEnd"/>
-            <w:r>
-              <w:t xml:space="preserve"> </w:t>
+              <w:t xml:space="preserve">[Link]    </w:t>
             </w:r>
           </w:p>
         </w:tc>
@@ -6501,15 +6328,7 @@
               <w:pStyle w:val="NoSpacing"/>
             </w:pPr>
             <w:r>
-              <w:t>[</w:t>
-            </w:r>
-            <w:proofErr w:type="gramStart"/>
-            <w:r>
-              <w:t xml:space="preserve">Link]   </w:t>
-            </w:r>
-            <w:proofErr w:type="gramEnd"/>
-            <w:r>
-              <w:t xml:space="preserve"> </w:t>
+              <w:t xml:space="preserve">[Link]    </w:t>
             </w:r>
           </w:p>
         </w:tc>
@@ -6698,15 +6517,7 @@
         </w:numPr>
       </w:pPr>
       <w:r>
-        <w:t xml:space="preserve">Run </w:t>
-      </w:r>
-      <w:proofErr w:type="gramStart"/>
-      <w:r>
-        <w:t>Pre-interview</w:t>
-      </w:r>
-      <w:proofErr w:type="gramEnd"/>
-      <w:r>
-        <w:t xml:space="preserve"> recruiter bridge prompt (or Gatekeeper - pre-interview communication.md) to clarify expectations and build early rapport</w:t>
+        <w:t>Run Pre-interview recruiter bridge prompt (or Gatekeeper - pre-interview communication.md) to clarify expectations and build early rapport</w:t>
       </w:r>
     </w:p>
     <w:p>
@@ -8434,10 +8245,7 @@
       </w:r>
       <w:proofErr w:type="spellEnd"/>
       <w:r>
-        <w:t xml:space="preserve"> with new role details.</w:t>
-      </w:r>
-      <w:r>
-        <w:t xml:space="preserve"> </w:t>
+        <w:t xml:space="preserve"> with new role details. </w:t>
       </w:r>
     </w:p>
     <w:p>
@@ -9222,61 +9030,7 @@
           <w:sz w:val="10"/>
           <w:szCs w:val="10"/>
         </w:rPr>
-        <w:t>| (</w:t>
-      </w:r>
-      <w:proofErr w:type="gramStart"/>
-      <w:r>
-        <w:rPr>
-          <w:rFonts w:ascii="Courier New" w:hAnsi="Courier New" w:cs="Courier New"/>
-          <w:sz w:val="10"/>
-          <w:szCs w:val="10"/>
-        </w:rPr>
-        <w:t xml:space="preserve">Example)   </w:t>
-      </w:r>
-      <w:proofErr w:type="gramEnd"/>
-      <w:r>
-        <w:rPr>
-          <w:rFonts w:ascii="Courier New" w:hAnsi="Courier New" w:cs="Courier New"/>
-          <w:sz w:val="10"/>
-          <w:szCs w:val="10"/>
-        </w:rPr>
-        <w:t xml:space="preserve">           | (</w:t>
-      </w:r>
-      <w:proofErr w:type="gramStart"/>
-      <w:r>
-        <w:rPr>
-          <w:rFonts w:ascii="Courier New" w:hAnsi="Courier New" w:cs="Courier New"/>
-          <w:sz w:val="10"/>
-          <w:szCs w:val="10"/>
-        </w:rPr>
-        <w:t xml:space="preserve">Example)   </w:t>
-      </w:r>
-      <w:proofErr w:type="gramEnd"/>
-      <w:r>
-        <w:rPr>
-          <w:rFonts w:ascii="Courier New" w:hAnsi="Courier New" w:cs="Courier New"/>
-          <w:sz w:val="10"/>
-          <w:szCs w:val="10"/>
-        </w:rPr>
-        <w:t xml:space="preserve">| YYYY-MM-DD       | Applied / </w:t>
-      </w:r>
-      <w:proofErr w:type="gramStart"/>
-      <w:r>
-        <w:rPr>
-          <w:rFonts w:ascii="Courier New" w:hAnsi="Courier New" w:cs="Courier New"/>
-          <w:sz w:val="10"/>
-          <w:szCs w:val="10"/>
-        </w:rPr>
-        <w:t>Interviewing  |</w:t>
-      </w:r>
-      <w:proofErr w:type="gramEnd"/>
-      <w:r>
-        <w:rPr>
-          <w:rFonts w:ascii="Courier New" w:hAnsi="Courier New" w:cs="Courier New"/>
-          <w:sz w:val="10"/>
-          <w:szCs w:val="10"/>
-        </w:rPr>
-        <w:t xml:space="preserve"> Strong tech stack alignment            | Thank-you note sent          |</w:t>
+        <w:t>| (Example)              | (Example)   | YYYY-MM-DD       | Applied / Interviewing  | Strong tech stack alignment            | Thank-you note sent          |</w:t>
       </w:r>
     </w:p>
     <w:p>
@@ -10068,13 +9822,8 @@
             <w:pPr>
               <w:pStyle w:val="NoSpacing"/>
             </w:pPr>
-            <w:proofErr w:type="gramStart"/>
-            <w:r>
-              <w:t>Open Source</w:t>
-            </w:r>
-            <w:proofErr w:type="gramEnd"/>
-            <w:r>
-              <w:t xml:space="preserve"> Intelligence</w:t>
+            <w:r>
+              <w:t>Open Source Intelligence</w:t>
             </w:r>
           </w:p>
         </w:tc>
@@ -10314,7 +10063,7 @@
       </w:pPr>
     </w:p>
     <w:sectPr>
-      <w:headerReference w:type="default" r:id="rId8"/>
+      <w:headerReference w:type="default" r:id="rId14"/>
       <w:pgSz w:w="11906" w:h="16838"/>
       <w:pgMar w:top="1440" w:right="1440" w:bottom="1440" w:left="1440" w:header="708" w:footer="708" w:gutter="0"/>
       <w:cols w:space="708"/>
@@ -12373,6 +12122,18 @@
       <w:szCs w:val="24"/>
     </w:rPr>
   </w:style>
+  <w:style w:type="character" w:styleId="UnresolvedMention">
+    <w:name w:val="Unresolved Mention"/>
+    <w:basedOn w:val="DefaultParagraphFont"/>
+    <w:uiPriority w:val="99"/>
+    <w:semiHidden/>
+    <w:unhideWhenUsed/>
+    <w:rsid w:val="00012308"/>
+    <w:rPr>
+      <w:color w:val="605E5C"/>
+      <w:shd w:val="clear" w:color="auto" w:fill="E1DFDD"/>
+    </w:rPr>
+  </w:style>
 </w:styles>
 </file>
 

</xml_diff>

<commit_message>
Fixed another spelling issue
</commit_message>
<xml_diff>
--- a/Job seeker's playbook.docx
+++ b/Job seeker's playbook.docx
@@ -2573,23 +2573,7 @@
         <w:t>- Minor cleanups:</w:t>
       </w:r>
       <w:r>
-        <w:t xml:space="preserve"> Renamed/updated LinkedIn </w:t>
-      </w:r>
-      <w:proofErr w:type="spellStart"/>
-      <w:r>
-        <w:t>Headhunter</w:t>
-      </w:r>
-      <w:proofErr w:type="spellEnd"/>
-      <w:r>
-        <w:t xml:space="preserve"> Tuning prompt, new </w:t>
-      </w:r>
-      <w:proofErr w:type="spellStart"/>
-      <w:r>
-        <w:t>Behavioral</w:t>
-      </w:r>
-      <w:proofErr w:type="spellEnd"/>
-      <w:r>
-        <w:t xml:space="preserve"> Interview Diagnostic.md, Elevator Pitch Generator.md, etc.</w:t>
+        <w:t xml:space="preserve"> Renamed/updated LinkedIn Headhunter Tuning prompt, new Behavioral Interview Diagnostic.md, Elevator Pitch Generator.md, etc.</w:t>
       </w:r>
     </w:p>
     <w:p>
@@ -2863,11 +2847,7 @@
         <w:t>Action:</w:t>
       </w:r>
       <w:r>
-        <w:t xml:space="preserve"> Run these three prompts in order before doing anything else. Save the final output as Master-Career-Profile.md — this becomes your living skills and experience document. Update it regularly using the </w:t>
-      </w:r>
-      <w:proofErr w:type="spellStart"/>
-      <w:r>
-        <w:t>Master</w:t>
+        <w:t xml:space="preserve"> Run these three prompts in order before doing anything else. Save the final output as Master-Career-Profile.md — this becomes your living skills and experience document. Update it regularly using the Master</w:t>
       </w:r>
       <w:r>
         <w:rPr>
@@ -2876,11 +2856,7 @@
         <w:t>Summary</w:t>
       </w:r>
       <w:r>
-        <w:t>Maintenance_Engine</w:t>
-      </w:r>
-      <w:proofErr w:type="spellEnd"/>
-      <w:r>
-        <w:t>.</w:t>
+        <w:t>Maintenance_Engine.</w:t>
       </w:r>
     </w:p>
     <w:p>
@@ -3028,23 +3004,28 @@
                 <w:b/>
                 <w:bCs/>
               </w:rPr>
-              <w:t xml:space="preserve">Projects / </w:t>
-            </w:r>
-            <w:proofErr w:type="spellStart"/>
-            <w:r>
+              <w:t xml:space="preserve">Projects / Workareas?          </w:t>
+            </w:r>
+          </w:p>
+        </w:tc>
+        <w:tc>
+          <w:tcPr>
+            <w:tcW w:w="1288" w:type="dxa"/>
+          </w:tcPr>
+          <w:p>
+            <w:pPr>
+              <w:pStyle w:val="NoSpacing"/>
               <w:rPr>
                 <w:b/>
                 <w:bCs/>
               </w:rPr>
-              <w:t>Workareas</w:t>
-            </w:r>
-            <w:proofErr w:type="spellEnd"/>
+            </w:pPr>
             <w:r>
               <w:rPr>
                 <w:b/>
                 <w:bCs/>
               </w:rPr>
-              <w:t xml:space="preserve">?          </w:t>
+              <w:t xml:space="preserve">Key Strengths for Job Search                          </w:t>
             </w:r>
           </w:p>
         </w:tc>
@@ -3065,7 +3046,7 @@
                 <w:b/>
                 <w:bCs/>
               </w:rPr>
-              <w:t xml:space="preserve">Key Strengths for Job Search                          </w:t>
+              <w:t xml:space="preserve">Main Weaknesses                              </w:t>
             </w:r>
           </w:p>
         </w:tc>
@@ -3086,27 +3067,6 @@
                 <w:b/>
                 <w:bCs/>
               </w:rPr>
-              <w:t xml:space="preserve">Main Weaknesses                              </w:t>
-            </w:r>
-          </w:p>
-        </w:tc>
-        <w:tc>
-          <w:tcPr>
-            <w:tcW w:w="1288" w:type="dxa"/>
-          </w:tcPr>
-          <w:p>
-            <w:pPr>
-              <w:pStyle w:val="NoSpacing"/>
-              <w:rPr>
-                <w:b/>
-                <w:bCs/>
-              </w:rPr>
-            </w:pPr>
-            <w:r>
-              <w:rPr>
-                <w:b/>
-                <w:bCs/>
-              </w:rPr>
               <w:t xml:space="preserve">Best For                                      </w:t>
             </w:r>
           </w:p>
@@ -3122,15 +3082,7 @@
               <w:pStyle w:val="NoSpacing"/>
             </w:pPr>
             <w:r>
-              <w:t>Grok (</w:t>
-            </w:r>
-            <w:proofErr w:type="spellStart"/>
-            <w:r>
-              <w:t>xAI</w:t>
-            </w:r>
-            <w:proofErr w:type="spellEnd"/>
-            <w:r>
-              <w:t xml:space="preserve">)     </w:t>
+              <w:t xml:space="preserve">Grok (xAI)     </w:t>
             </w:r>
           </w:p>
         </w:tc>
@@ -3497,15 +3449,7 @@
               <w:pStyle w:val="NoSpacing"/>
             </w:pPr>
             <w:r>
-              <w:t xml:space="preserve">Deep resume tailoring, </w:t>
-            </w:r>
-            <w:proofErr w:type="spellStart"/>
-            <w:r>
-              <w:t>behavioral</w:t>
-            </w:r>
-            <w:proofErr w:type="spellEnd"/>
-            <w:r>
-              <w:t xml:space="preserve"> stories, complex analysis </w:t>
+              <w:t xml:space="preserve">Deep resume tailoring, behavioral stories, complex analysis </w:t>
             </w:r>
           </w:p>
         </w:tc>
@@ -3781,21 +3725,7 @@
         <w:rPr>
           <w:b/>
         </w:rPr>
-        <w:t xml:space="preserve">Projects / </w:t>
-      </w:r>
-      <w:proofErr w:type="spellStart"/>
-      <w:r>
-        <w:rPr>
-          <w:b/>
-        </w:rPr>
-        <w:t>Workareas</w:t>
-      </w:r>
-      <w:proofErr w:type="spellEnd"/>
-      <w:r>
-        <w:rPr>
-          <w:b/>
-        </w:rPr>
-        <w:t xml:space="preserve"> matter</w:t>
+        <w:t>Projects / Workareas matter</w:t>
       </w:r>
       <w:r>
         <w:t xml:space="preserve"> — Claude and Gemini give you folders even on free accounts. Use them to keep your Master-Career-Profile, job postings, and tailored materials organized.</w:t>
@@ -3815,15 +3745,7 @@
         <w:t>When to upgrade</w:t>
       </w:r>
       <w:r>
-        <w:t xml:space="preserve"> — If you’re doing 20+ serious applications per week, consider one paid plan ($20/</w:t>
-      </w:r>
-      <w:proofErr w:type="spellStart"/>
-      <w:r>
-        <w:t>mo</w:t>
-      </w:r>
-      <w:proofErr w:type="spellEnd"/>
-      <w:r>
-        <w:t xml:space="preserve"> range) for the engine you like most. One paid subscription + two free engines usually gives unlimited effective capacity.</w:t>
+        <w:t xml:space="preserve"> — If you’re doing 20+ serious applications per week, consider one paid plan ($20/mo range) for the engine you like most. One paid subscription + two free engines usually gives unlimited effective capacity.</w:t>
       </w:r>
     </w:p>
     <w:p>
@@ -4015,16 +3937,8 @@
         <w:rPr>
           <w:rFonts w:ascii="Courier New" w:hAnsi="Courier New" w:cs="Courier New"/>
         </w:rPr>
-        <w:t>── Interviews/              ← Prep notes, mock transcripts, thank-</w:t>
-      </w:r>
-      <w:proofErr w:type="spellStart"/>
-      <w:r>
-        <w:rPr>
-          <w:rFonts w:ascii="Courier New" w:hAnsi="Courier New" w:cs="Courier New"/>
-        </w:rPr>
-        <w:t>yous</w:t>
-      </w:r>
-      <w:proofErr w:type="spellEnd"/>
+        <w:t>── Interviews/              ← Prep notes, mock transcripts, thank-yous</w:t>
+      </w:r>
     </w:p>
     <w:p>
       <w:pPr>
@@ -4382,16 +4296,8 @@
         <w:rPr>
           <w:b/>
         </w:rPr>
-        <w:t xml:space="preserve">Job posting red flag </w:t>
-      </w:r>
-      <w:proofErr w:type="spellStart"/>
-      <w:r>
-        <w:rPr>
-          <w:b/>
-        </w:rPr>
-        <w:t>analyzer</w:t>
-      </w:r>
-      <w:proofErr w:type="spellEnd"/>
+        <w:t>Job posting red flag analyzer</w:t>
+      </w:r>
       <w:r>
         <w:t xml:space="preserve"> on any role you’re considering (even before you apply).</w:t>
       </w:r>
@@ -5065,8 +4971,16 @@
             <w:pPr>
               <w:pStyle w:val="NoSpacing"/>
             </w:pPr>
-            <w:r>
-              <w:t xml:space="preserve">[Link]                     </w:t>
+            <w:hyperlink r:id="rId14" w:history="1">
+              <w:r>
+                <w:rPr>
+                  <w:rStyle w:val="Hyperlink"/>
+                </w:rPr>
+                <w:t xml:space="preserve">[Link]                    </w:t>
+              </w:r>
+            </w:hyperlink>
+            <w:r>
+              <w:t xml:space="preserve"> </w:t>
             </w:r>
           </w:p>
         </w:tc>
@@ -5081,7 +4995,13 @@
               <w:pStyle w:val="NoSpacing"/>
             </w:pPr>
             <w:r>
-              <w:t xml:space="preserve">LinkedIn Profile Analyzer + Connection tools </w:t>
+              <w:t>LinkedIn Profile Analy</w:t>
+            </w:r>
+            <w:r>
+              <w:t>s</w:t>
+            </w:r>
+            <w:r>
+              <w:t xml:space="preserve">er + Connection tools </w:t>
             </w:r>
           </w:p>
         </w:tc>
@@ -5106,13 +5026,8 @@
             <w:pPr>
               <w:pStyle w:val="NoSpacing"/>
             </w:pPr>
-            <w:proofErr w:type="spellStart"/>
-            <w:r>
-              <w:t>Analyzes</w:t>
-            </w:r>
-            <w:proofErr w:type="spellEnd"/>
-            <w:r>
-              <w:t xml:space="preserve"> &amp; grows your professional network        </w:t>
+            <w:r>
+              <w:t xml:space="preserve">Analyzes &amp; grows your professional network        </w:t>
             </w:r>
           </w:p>
         </w:tc>
@@ -5405,16 +5320,8 @@
         <w:rPr>
           <w:b/>
         </w:rPr>
-        <w:t xml:space="preserve">Job posting red flag </w:t>
-      </w:r>
-      <w:proofErr w:type="spellStart"/>
-      <w:r>
-        <w:rPr>
-          <w:b/>
-        </w:rPr>
-        <w:t>analyzer</w:t>
-      </w:r>
-      <w:proofErr w:type="spellEnd"/>
+        <w:t>Job posting red flag analyzer</w:t>
+      </w:r>
       <w:r>
         <w:t xml:space="preserve">  </w:t>
       </w:r>
@@ -5435,15 +5342,7 @@
         <w:pStyle w:val="NoSpacing"/>
       </w:pPr>
       <w:r>
-        <w:t xml:space="preserve">   - Document your decision in your Command </w:t>
-      </w:r>
-      <w:proofErr w:type="spellStart"/>
-      <w:r>
-        <w:t>Center</w:t>
-      </w:r>
-      <w:proofErr w:type="spellEnd"/>
-      <w:r>
-        <w:t xml:space="preserve"> tracker</w:t>
+        <w:t xml:space="preserve">   - Document your decision in your Command Center tracker</w:t>
       </w:r>
     </w:p>
     <w:p>
@@ -5550,16 +5449,8 @@
         <w:rPr>
           <w:b/>
         </w:rPr>
-        <w:t xml:space="preserve">Command </w:t>
-      </w:r>
-      <w:proofErr w:type="spellStart"/>
-      <w:r>
-        <w:rPr>
-          <w:b/>
-        </w:rPr>
-        <w:t>Center</w:t>
-      </w:r>
-      <w:proofErr w:type="spellEnd"/>
+        <w:t>Command Center</w:t>
+      </w:r>
       <w:r>
         <w:t xml:space="preserve"> (see Phase 7 for tracker template):</w:t>
       </w:r>
@@ -6053,15 +5944,7 @@
               <w:pStyle w:val="NoSpacing"/>
             </w:pPr>
             <w:r>
-              <w:t xml:space="preserve">Job posting red flag </w:t>
-            </w:r>
-            <w:proofErr w:type="spellStart"/>
-            <w:r>
-              <w:t>analyzer</w:t>
-            </w:r>
-            <w:proofErr w:type="spellEnd"/>
-            <w:r>
-              <w:t xml:space="preserve">                      </w:t>
+              <w:t xml:space="preserve">Job posting red flag analyzer                      </w:t>
             </w:r>
           </w:p>
         </w:tc>
@@ -6296,13 +6179,8 @@
             <w:pPr>
               <w:pStyle w:val="NoSpacing"/>
             </w:pPr>
-            <w:proofErr w:type="spellStart"/>
-            <w:r>
-              <w:t>Analyzes</w:t>
-            </w:r>
-            <w:proofErr w:type="spellEnd"/>
-            <w:r>
-              <w:t xml:space="preserve"> fit + suggests strongest positioning             </w:t>
+            <w:r>
+              <w:t xml:space="preserve">Analyzes fit + suggests strongest positioning             </w:t>
             </w:r>
           </w:p>
         </w:tc>
@@ -6697,15 +6575,7 @@
         </w:numPr>
       </w:pPr>
       <w:r>
-        <w:t xml:space="preserve">Update your Command </w:t>
-      </w:r>
-      <w:proofErr w:type="spellStart"/>
-      <w:r>
-        <w:t>Center</w:t>
-      </w:r>
-      <w:proofErr w:type="spellEnd"/>
-      <w:r>
-        <w:t xml:space="preserve"> tracker with interview details and status</w:t>
+        <w:t>Update your Command Center tracker with interview details and status</w:t>
       </w:r>
     </w:p>
     <w:p>
@@ -7770,15 +7640,7 @@
         <w:ind w:left="720"/>
       </w:pPr>
       <w:r>
-        <w:t xml:space="preserve">Log the full offer details into your Command </w:t>
-      </w:r>
-      <w:proofErr w:type="spellStart"/>
-      <w:r>
-        <w:t>Center</w:t>
-      </w:r>
-      <w:proofErr w:type="spellEnd"/>
-      <w:r>
-        <w:t xml:space="preserve"> tracker (update status to “Offer Received”).</w:t>
+        <w:t>Log the full offer details into your Command Center tracker (update status to “Offer Received”).</w:t>
       </w:r>
     </w:p>
     <w:p>
@@ -8156,15 +8018,7 @@
         <w:ind w:left="720"/>
       </w:pPr>
       <w:r>
-        <w:t xml:space="preserve">Update Command </w:t>
-      </w:r>
-      <w:proofErr w:type="spellStart"/>
-      <w:r>
-        <w:t>Center</w:t>
-      </w:r>
-      <w:proofErr w:type="spellEnd"/>
-      <w:r>
-        <w:t>:</w:t>
+        <w:t>Update Command Center:</w:t>
       </w:r>
       <w:r>
         <w:t xml:space="preserve"> Mark as “Accepted” + note final terms.</w:t>
@@ -8237,15 +8091,7 @@
         <w:ind w:left="720"/>
       </w:pPr>
       <w:r>
-        <w:t xml:space="preserve">Update your Master-Career-Profile using </w:t>
-      </w:r>
-      <w:proofErr w:type="spellStart"/>
-      <w:r>
-        <w:t>Master_Summary_Maintenance_Engine</w:t>
-      </w:r>
-      <w:proofErr w:type="spellEnd"/>
-      <w:r>
-        <w:t xml:space="preserve"> with new role details. </w:t>
+        <w:t xml:space="preserve">Update your Master-Career-Profile using Master_Summary_Maintenance_Engine with new role details. </w:t>
       </w:r>
     </w:p>
     <w:p>
@@ -8705,13 +8551,8 @@
             <w:pPr>
               <w:pStyle w:val="NoSpacing"/>
             </w:pPr>
-            <w:proofErr w:type="spellStart"/>
-            <w:r>
-              <w:t>Master_Summary_Maintenance_Engine</w:t>
-            </w:r>
-            <w:proofErr w:type="spellEnd"/>
-            <w:r>
-              <w:t xml:space="preserve">                  </w:t>
+            <w:r>
+              <w:t xml:space="preserve">Master_Summary_Maintenance_Engine                  </w:t>
             </w:r>
           </w:p>
         </w:tc>
@@ -8936,15 +8777,7 @@
       <w:bookmarkStart w:id="83" w:name="_Toc227007091"/>
       <w:r>
         <w:lastRenderedPageBreak/>
-        <w:t xml:space="preserve">Command </w:t>
-      </w:r>
-      <w:proofErr w:type="spellStart"/>
-      <w:r>
-        <w:t>Center</w:t>
-      </w:r>
-      <w:proofErr w:type="spellEnd"/>
-      <w:r>
-        <w:t xml:space="preserve"> Tracker</w:t>
+        <w:t>Command Center Tracker</w:t>
       </w:r>
       <w:bookmarkEnd w:id="82"/>
       <w:bookmarkEnd w:id="83"/>
@@ -9306,17 +9139,8 @@
           <w:b/>
           <w:bCs/>
         </w:rPr>
-        <w:t xml:space="preserve">Command </w:t>
-      </w:r>
-      <w:proofErr w:type="spellStart"/>
-      <w:r>
-        <w:rPr>
-          <w:b/>
-          <w:bCs/>
-        </w:rPr>
-        <w:t>Center</w:t>
-      </w:r>
-      <w:proofErr w:type="spellEnd"/>
+        <w:t>Command Center</w:t>
+      </w:r>
       <w:r>
         <w:t xml:space="preserve"> Your central tracking system (spreadsheet, Notion, or simple table) that logs every job application, interview, offer, and key intel.</w:t>
       </w:r>
@@ -9409,15 +9233,7 @@
         <w:t>STAR Stories</w:t>
       </w:r>
       <w:r>
-        <w:t xml:space="preserve"> Situation, Task, Action, Result — the structured format used for </w:t>
-      </w:r>
-      <w:proofErr w:type="spellStart"/>
-      <w:r>
-        <w:t>behavioral</w:t>
-      </w:r>
-      <w:proofErr w:type="spellEnd"/>
-      <w:r>
-        <w:t xml:space="preserve"> interview answers.</w:t>
+        <w:t xml:space="preserve"> Situation, Task, Action, Result — the structured format used for behavioral interview answers.</w:t>
       </w:r>
     </w:p>
     <w:p>
@@ -9988,15 +9804,7 @@
               <w:pStyle w:val="NoSpacing"/>
             </w:pPr>
             <w:r>
-              <w:t xml:space="preserve">Structured format for answering </w:t>
-            </w:r>
-            <w:proofErr w:type="spellStart"/>
-            <w:r>
-              <w:t>behavioral</w:t>
-            </w:r>
-            <w:proofErr w:type="spellEnd"/>
-            <w:r>
-              <w:t xml:space="preserve"> interview questions</w:t>
+              <w:t>Structured format for answering behavioral interview questions</w:t>
             </w:r>
           </w:p>
         </w:tc>
@@ -10063,7 +9871,7 @@
       </w:pPr>
     </w:p>
     <w:sectPr>
-      <w:headerReference w:type="default" r:id="rId14"/>
+      <w:headerReference w:type="default" r:id="rId15"/>
       <w:pgSz w:w="11906" w:h="16838"/>
       <w:pgMar w:top="1440" w:right="1440" w:bottom="1440" w:left="1440" w:header="708" w:footer="708" w:gutter="0"/>
       <w:cols w:space="708"/>

</xml_diff>